<commit_message>
Tighten MICE legal applicability outputs
</commit_message>
<xml_diff>
--- a/outputs/may-2026-real-events/details/01-coex-koba-2026/bundle/documents/safety-plan.docx
+++ b/outputs/may-2026-real-events/details/01-coex-koba-2026/bundle/documents/safety-plan.docx
@@ -1233,1567 +1233,7 @@
         </w:numPr>
       </w:pPr>
       <w:r>
-        <w:t xml:space="preserve">서울특별시 — 서울특별시 옥외광고물 등의 관리와 옥외광고산업 진흥에 관한 조례 (옥외광고물 관리 조례, 시행 20260518)</w:t>
-      </w:r>
-    </w:p>
-    <w:p>
-      <w:pPr>
-        <w:pStyle w:val="ListParagraph"/>
-        <w:numPr>
-          <w:ilvl w:val="0"/>
-          <w:numId w:val="1"/>
-        </w:numPr>
-      </w:pPr>
-      <w:r>
-        <w:t xml:space="preserve">조례 우선순위: primary / 610점 — 관할 지자체 정확 매칭: 서울특별시; 현수막·배너·안내물 조건 후보; 조문 발췌 보유</w:t>
-      </w:r>
-    </w:p>
-    <w:p>
-      <w:pPr>
-        <w:pStyle w:val="ListParagraph"/>
-        <w:numPr>
-          <w:ilvl w:val="0"/>
-          <w:numId w:val="1"/>
-        </w:numPr>
-      </w:pPr>
-      <w:r>
-        <w:t xml:space="preserve">적용: 행사 홍보·안내를 위해 현수막, 배너, 안내판, 지주형 표시물, 전광류·전기 사용 광고물을 옥외에 표시·설치하는 경우</w:t>
-      </w:r>
-    </w:p>
-    <w:p>
-      <w:pPr>
-        <w:pStyle w:val="ListParagraph"/>
-        <w:numPr>
-          <w:ilvl w:val="0"/>
-          <w:numId w:val="1"/>
-        </w:numPr>
-      </w:pPr>
-      <w:r>
-        <w:t xml:space="preserve">인원/조건: 인원 기준보다 표시 장소, 광고물 종류, 크기, 기간, 전기 사용 여부, 안전점검 대상 여부 확인</w:t>
-      </w:r>
-    </w:p>
-    <w:p>
-      <w:pPr>
-        <w:pStyle w:val="ListParagraph"/>
-        <w:numPr>
-          <w:ilvl w:val="0"/>
-          <w:numId w:val="1"/>
-        </w:numPr>
-      </w:pPr>
-      <w:r>
-        <w:t xml:space="preserve">제출기한: 표시·설치 전 허가/신고 및 게시대 신청 기한을 관할 지자체 기준으로 확인</w:t>
-      </w:r>
-    </w:p>
-    <w:p>
-      <w:pPr>
-        <w:pStyle w:val="ListParagraph"/>
-        <w:numPr>
-          <w:ilvl w:val="0"/>
-          <w:numId w:val="1"/>
-        </w:numPr>
-      </w:pPr>
-      <w:r>
-        <w:t xml:space="preserve">핵심 발췌: 목적: 제1조(목적) 이 조례는 「옥외광고물 등의 관리와 옥외광고산업 진흥에 관한 법률」 및 같은 법 시행령에서 위임된 사항과 그 시행에 관하여 필요한 사항을 규정함을 목적으로 한다.[전문개정 2025.5.19]</w:t>
-      </w:r>
-    </w:p>
-    <w:p>
-      <w:pPr>
-        <w:pStyle w:val="ListParagraph"/>
-        <w:numPr>
-          <w:ilvl w:val="0"/>
-          <w:numId w:val="1"/>
-        </w:numPr>
-      </w:pPr>
-      <w:r>
-        <w:t xml:space="preserve">서울특별시 강남구 — 서울특별시 강남구 옥외광고물 등의 관리와 옥외광고산업 진흥에 관한 조례 (옥외광고물 관리 조례, 시행 20250321)</w:t>
-      </w:r>
-    </w:p>
-    <w:p>
-      <w:pPr>
-        <w:pStyle w:val="ListParagraph"/>
-        <w:numPr>
-          <w:ilvl w:val="0"/>
-          <w:numId w:val="1"/>
-        </w:numPr>
-      </w:pPr>
-      <w:r>
-        <w:t xml:space="preserve">조례 우선순위: primary / 580점 — 관할 지자체 정확 매칭: 서울특별시 강남구; 현수막·배너·안내물 조건 후보</w:t>
-      </w:r>
-    </w:p>
-    <w:p>
-      <w:pPr>
-        <w:pStyle w:val="ListParagraph"/>
-        <w:numPr>
-          <w:ilvl w:val="0"/>
-          <w:numId w:val="1"/>
-        </w:numPr>
-      </w:pPr>
-      <w:r>
-        <w:t xml:space="preserve">적용: 행사 홍보·안내를 위해 현수막, 배너, 안내판, 지주형 표시물, 전광류·전기 사용 광고물을 옥외에 표시·설치하는 경우</w:t>
-      </w:r>
-    </w:p>
-    <w:p>
-      <w:pPr>
-        <w:pStyle w:val="ListParagraph"/>
-        <w:numPr>
-          <w:ilvl w:val="0"/>
-          <w:numId w:val="1"/>
-        </w:numPr>
-      </w:pPr>
-      <w:r>
-        <w:t xml:space="preserve">인원/조건: 인원 기준보다 표시 장소, 광고물 종류, 크기, 기간, 전기 사용 여부, 안전점검 대상 여부 확인</w:t>
-      </w:r>
-    </w:p>
-    <w:p>
-      <w:pPr>
-        <w:pStyle w:val="ListParagraph"/>
-        <w:numPr>
-          <w:ilvl w:val="0"/>
-          <w:numId w:val="1"/>
-        </w:numPr>
-      </w:pPr>
-      <w:r>
-        <w:t xml:space="preserve">제출기한: 표시·설치 전 허가/신고 및 게시대 신청 기한을 관할 지자체 기준으로 확인</w:t>
-      </w:r>
-    </w:p>
-    <w:p>
-      <w:pPr>
-        <w:pStyle w:val="ListParagraph"/>
-        <w:numPr>
-          <w:ilvl w:val="0"/>
-          <w:numId w:val="1"/>
-        </w:numPr>
-      </w:pPr>
-      <w:r>
-        <w:t xml:space="preserve">서울특별시 강동구 — 서울특별시 강동구 옥외광고물 등의 관리와 옥외광고산업 진흥에 관한 조례 (옥외광고물 관리 조례, 시행 20230705)</w:t>
-      </w:r>
-    </w:p>
-    <w:p>
-      <w:pPr>
-        <w:pStyle w:val="ListParagraph"/>
-        <w:numPr>
-          <w:ilvl w:val="0"/>
-          <w:numId w:val="1"/>
-        </w:numPr>
-      </w:pPr>
-      <w:r>
-        <w:t xml:space="preserve">조례 우선순위: secondary / 330점 — 관할 후보 부분 매칭: 서울특별시; 현수막·배너·안내물 조건 후보</w:t>
-      </w:r>
-    </w:p>
-    <w:p>
-      <w:pPr>
-        <w:pStyle w:val="ListParagraph"/>
-        <w:numPr>
-          <w:ilvl w:val="0"/>
-          <w:numId w:val="1"/>
-        </w:numPr>
-      </w:pPr>
-      <w:r>
-        <w:t xml:space="preserve">적용: 행사 홍보·안내를 위해 현수막, 배너, 안내판, 지주형 표시물, 전광류·전기 사용 광고물을 옥외에 표시·설치하는 경우</w:t>
-      </w:r>
-    </w:p>
-    <w:p>
-      <w:pPr>
-        <w:pStyle w:val="ListParagraph"/>
-        <w:numPr>
-          <w:ilvl w:val="0"/>
-          <w:numId w:val="1"/>
-        </w:numPr>
-      </w:pPr>
-      <w:r>
-        <w:t xml:space="preserve">인원/조건: 인원 기준보다 표시 장소, 광고물 종류, 크기, 기간, 전기 사용 여부, 안전점검 대상 여부 확인</w:t>
-      </w:r>
-    </w:p>
-    <w:p>
-      <w:pPr>
-        <w:pStyle w:val="ListParagraph"/>
-        <w:numPr>
-          <w:ilvl w:val="0"/>
-          <w:numId w:val="1"/>
-        </w:numPr>
-      </w:pPr>
-      <w:r>
-        <w:t xml:space="preserve">제출기한: 표시·설치 전 허가/신고 및 게시대 신청 기한을 관할 지자체 기준으로 확인</w:t>
-      </w:r>
-    </w:p>
-    <w:p>
-      <w:pPr>
-        <w:pStyle w:val="ListParagraph"/>
-        <w:numPr>
-          <w:ilvl w:val="0"/>
-          <w:numId w:val="1"/>
-        </w:numPr>
-      </w:pPr>
-      <w:r>
-        <w:t xml:space="preserve">서울특별시 강북구 — 서울특별시 강북구 옥외광고물 등의 관리와 옥외광고산업 진흥에 관한 조례 (옥외광고물 관리 조례, 시행 20241101)</w:t>
-      </w:r>
-    </w:p>
-    <w:p>
-      <w:pPr>
-        <w:pStyle w:val="ListParagraph"/>
-        <w:numPr>
-          <w:ilvl w:val="0"/>
-          <w:numId w:val="1"/>
-        </w:numPr>
-      </w:pPr>
-      <w:r>
-        <w:t xml:space="preserve">조례 우선순위: secondary / 330점 — 관할 후보 부분 매칭: 서울특별시; 현수막·배너·안내물 조건 후보</w:t>
-      </w:r>
-    </w:p>
-    <w:p>
-      <w:pPr>
-        <w:pStyle w:val="ListParagraph"/>
-        <w:numPr>
-          <w:ilvl w:val="0"/>
-          <w:numId w:val="1"/>
-        </w:numPr>
-      </w:pPr>
-      <w:r>
-        <w:t xml:space="preserve">적용: 행사 홍보·안내를 위해 현수막, 배너, 안내판, 지주형 표시물, 전광류·전기 사용 광고물을 옥외에 표시·설치하는 경우</w:t>
-      </w:r>
-    </w:p>
-    <w:p>
-      <w:pPr>
-        <w:pStyle w:val="ListParagraph"/>
-        <w:numPr>
-          <w:ilvl w:val="0"/>
-          <w:numId w:val="1"/>
-        </w:numPr>
-      </w:pPr>
-      <w:r>
-        <w:t xml:space="preserve">인원/조건: 인원 기준보다 표시 장소, 광고물 종류, 크기, 기간, 전기 사용 여부, 안전점검 대상 여부 확인</w:t>
-      </w:r>
-    </w:p>
-    <w:p>
-      <w:pPr>
-        <w:pStyle w:val="ListParagraph"/>
-        <w:numPr>
-          <w:ilvl w:val="0"/>
-          <w:numId w:val="1"/>
-        </w:numPr>
-      </w:pPr>
-      <w:r>
-        <w:t xml:space="preserve">제출기한: 표시·설치 전 허가/신고 및 게시대 신청 기한을 관할 지자체 기준으로 확인</w:t>
-      </w:r>
-    </w:p>
-    <w:p>
-      <w:pPr>
-        <w:pStyle w:val="ListParagraph"/>
-        <w:numPr>
-          <w:ilvl w:val="0"/>
-          <w:numId w:val="1"/>
-        </w:numPr>
-      </w:pPr>
-      <w:r>
-        <w:t xml:space="preserve">서울특별시 강서구 — 서울특별시 강서구 옥외광고물 등의 관리와 옥외광고산업 진흥에 관한 조례 (옥외광고물 관리 조례, 시행 20251001)</w:t>
-      </w:r>
-    </w:p>
-    <w:p>
-      <w:pPr>
-        <w:pStyle w:val="ListParagraph"/>
-        <w:numPr>
-          <w:ilvl w:val="0"/>
-          <w:numId w:val="1"/>
-        </w:numPr>
-      </w:pPr>
-      <w:r>
-        <w:t xml:space="preserve">조례 우선순위: secondary / 330점 — 관할 후보 부분 매칭: 서울특별시; 현수막·배너·안내물 조건 후보</w:t>
-      </w:r>
-    </w:p>
-    <w:p>
-      <w:pPr>
-        <w:pStyle w:val="ListParagraph"/>
-        <w:numPr>
-          <w:ilvl w:val="0"/>
-          <w:numId w:val="1"/>
-        </w:numPr>
-      </w:pPr>
-      <w:r>
-        <w:t xml:space="preserve">적용: 행사 홍보·안내를 위해 현수막, 배너, 안내판, 지주형 표시물, 전광류·전기 사용 광고물을 옥외에 표시·설치하는 경우</w:t>
-      </w:r>
-    </w:p>
-    <w:p>
-      <w:pPr>
-        <w:pStyle w:val="ListParagraph"/>
-        <w:numPr>
-          <w:ilvl w:val="0"/>
-          <w:numId w:val="1"/>
-        </w:numPr>
-      </w:pPr>
-      <w:r>
-        <w:t xml:space="preserve">인원/조건: 인원 기준보다 표시 장소, 광고물 종류, 크기, 기간, 전기 사용 여부, 안전점검 대상 여부 확인</w:t>
-      </w:r>
-    </w:p>
-    <w:p>
-      <w:pPr>
-        <w:pStyle w:val="ListParagraph"/>
-        <w:numPr>
-          <w:ilvl w:val="0"/>
-          <w:numId w:val="1"/>
-        </w:numPr>
-      </w:pPr>
-      <w:r>
-        <w:t xml:space="preserve">제출기한: 표시·설치 전 허가/신고 및 게시대 신청 기한을 관할 지자체 기준으로 확인</w:t>
-      </w:r>
-    </w:p>
-    <w:p>
-      <w:pPr>
-        <w:pStyle w:val="ListParagraph"/>
-        <w:numPr>
-          <w:ilvl w:val="0"/>
-          <w:numId w:val="1"/>
-        </w:numPr>
-      </w:pPr>
-      <w:r>
-        <w:t xml:space="preserve">서울특별시 관악구 — 서울특별시 관악구 옥외광고물 등의 관리와 옥외광고산업 진흥에 관한 조례 (옥외광고물 관리 조례, 시행 20240411)</w:t>
-      </w:r>
-    </w:p>
-    <w:p>
-      <w:pPr>
-        <w:pStyle w:val="ListParagraph"/>
-        <w:numPr>
-          <w:ilvl w:val="0"/>
-          <w:numId w:val="1"/>
-        </w:numPr>
-      </w:pPr>
-      <w:r>
-        <w:t xml:space="preserve">조례 우선순위: secondary / 330점 — 관할 후보 부분 매칭: 서울특별시; 현수막·배너·안내물 조건 후보</w:t>
-      </w:r>
-    </w:p>
-    <w:p>
-      <w:pPr>
-        <w:pStyle w:val="ListParagraph"/>
-        <w:numPr>
-          <w:ilvl w:val="0"/>
-          <w:numId w:val="1"/>
-        </w:numPr>
-      </w:pPr>
-      <w:r>
-        <w:t xml:space="preserve">적용: 행사 홍보·안내를 위해 현수막, 배너, 안내판, 지주형 표시물, 전광류·전기 사용 광고물을 옥외에 표시·설치하는 경우</w:t>
-      </w:r>
-    </w:p>
-    <w:p>
-      <w:pPr>
-        <w:pStyle w:val="ListParagraph"/>
-        <w:numPr>
-          <w:ilvl w:val="0"/>
-          <w:numId w:val="1"/>
-        </w:numPr>
-      </w:pPr>
-      <w:r>
-        <w:t xml:space="preserve">인원/조건: 인원 기준보다 표시 장소, 광고물 종류, 크기, 기간, 전기 사용 여부, 안전점검 대상 여부 확인</w:t>
-      </w:r>
-    </w:p>
-    <w:p>
-      <w:pPr>
-        <w:pStyle w:val="ListParagraph"/>
-        <w:numPr>
-          <w:ilvl w:val="0"/>
-          <w:numId w:val="1"/>
-        </w:numPr>
-      </w:pPr>
-      <w:r>
-        <w:t xml:space="preserve">제출기한: 표시·설치 전 허가/신고 및 게시대 신청 기한을 관할 지자체 기준으로 확인</w:t>
-      </w:r>
-    </w:p>
-    <w:p>
-      <w:pPr>
-        <w:pStyle w:val="ListParagraph"/>
-        <w:numPr>
-          <w:ilvl w:val="0"/>
-          <w:numId w:val="1"/>
-        </w:numPr>
-      </w:pPr>
-      <w:r>
-        <w:t xml:space="preserve">서울특별시 광진구 — 서울특별시 광진구 옥외광고물 등의 관리와 옥외광고산업 진흥에 관한 조례 (옥외광고물 관리 조례, 시행 20250228)</w:t>
-      </w:r>
-    </w:p>
-    <w:p>
-      <w:pPr>
-        <w:pStyle w:val="ListParagraph"/>
-        <w:numPr>
-          <w:ilvl w:val="0"/>
-          <w:numId w:val="1"/>
-        </w:numPr>
-      </w:pPr>
-      <w:r>
-        <w:t xml:space="preserve">조례 우선순위: secondary / 330점 — 관할 후보 부분 매칭: 서울특별시; 현수막·배너·안내물 조건 후보</w:t>
-      </w:r>
-    </w:p>
-    <w:p>
-      <w:pPr>
-        <w:pStyle w:val="ListParagraph"/>
-        <w:numPr>
-          <w:ilvl w:val="0"/>
-          <w:numId w:val="1"/>
-        </w:numPr>
-      </w:pPr>
-      <w:r>
-        <w:t xml:space="preserve">적용: 행사 홍보·안내를 위해 현수막, 배너, 안내판, 지주형 표시물, 전광류·전기 사용 광고물을 옥외에 표시·설치하는 경우</w:t>
-      </w:r>
-    </w:p>
-    <w:p>
-      <w:pPr>
-        <w:pStyle w:val="ListParagraph"/>
-        <w:numPr>
-          <w:ilvl w:val="0"/>
-          <w:numId w:val="1"/>
-        </w:numPr>
-      </w:pPr>
-      <w:r>
-        <w:t xml:space="preserve">인원/조건: 인원 기준보다 표시 장소, 광고물 종류, 크기, 기간, 전기 사용 여부, 안전점검 대상 여부 확인</w:t>
-      </w:r>
-    </w:p>
-    <w:p>
-      <w:pPr>
-        <w:pStyle w:val="ListParagraph"/>
-        <w:numPr>
-          <w:ilvl w:val="0"/>
-          <w:numId w:val="1"/>
-        </w:numPr>
-      </w:pPr>
-      <w:r>
-        <w:t xml:space="preserve">제출기한: 표시·설치 전 허가/신고 및 게시대 신청 기한을 관할 지자체 기준으로 확인</w:t>
-      </w:r>
-    </w:p>
-    <w:p>
-      <w:pPr>
-        <w:pStyle w:val="ListParagraph"/>
-        <w:numPr>
-          <w:ilvl w:val="0"/>
-          <w:numId w:val="1"/>
-        </w:numPr>
-      </w:pPr>
-      <w:r>
-        <w:t xml:space="preserve">서울특별시 구로구 — 서울특별시 구로구 옥외광고물 등의 관리와 옥외광고산업 진흥에 관한 조례 (옥외광고물 관리 조례, 시행 20250306)</w:t>
-      </w:r>
-    </w:p>
-    <w:p>
-      <w:pPr>
-        <w:pStyle w:val="ListParagraph"/>
-        <w:numPr>
-          <w:ilvl w:val="0"/>
-          <w:numId w:val="1"/>
-        </w:numPr>
-      </w:pPr>
-      <w:r>
-        <w:t xml:space="preserve">조례 우선순위: secondary / 330점 — 관할 후보 부분 매칭: 서울특별시; 현수막·배너·안내물 조건 후보</w:t>
-      </w:r>
-    </w:p>
-    <w:p>
-      <w:pPr>
-        <w:pStyle w:val="ListParagraph"/>
-        <w:numPr>
-          <w:ilvl w:val="0"/>
-          <w:numId w:val="1"/>
-        </w:numPr>
-      </w:pPr>
-      <w:r>
-        <w:t xml:space="preserve">적용: 행사 홍보·안내를 위해 현수막, 배너, 안내판, 지주형 표시물, 전광류·전기 사용 광고물을 옥외에 표시·설치하는 경우</w:t>
-      </w:r>
-    </w:p>
-    <w:p>
-      <w:pPr>
-        <w:pStyle w:val="ListParagraph"/>
-        <w:numPr>
-          <w:ilvl w:val="0"/>
-          <w:numId w:val="1"/>
-        </w:numPr>
-      </w:pPr>
-      <w:r>
-        <w:t xml:space="preserve">인원/조건: 인원 기준보다 표시 장소, 광고물 종류, 크기, 기간, 전기 사용 여부, 안전점검 대상 여부 확인</w:t>
-      </w:r>
-    </w:p>
-    <w:p>
-      <w:pPr>
-        <w:pStyle w:val="ListParagraph"/>
-        <w:numPr>
-          <w:ilvl w:val="0"/>
-          <w:numId w:val="1"/>
-        </w:numPr>
-      </w:pPr>
-      <w:r>
-        <w:t xml:space="preserve">제출기한: 표시·설치 전 허가/신고 및 게시대 신청 기한을 관할 지자체 기준으로 확인</w:t>
-      </w:r>
-    </w:p>
-    <w:p>
-      <w:pPr>
-        <w:pStyle w:val="ListParagraph"/>
-        <w:numPr>
-          <w:ilvl w:val="0"/>
-          <w:numId w:val="1"/>
-        </w:numPr>
-      </w:pPr>
-      <w:r>
-        <w:t xml:space="preserve">서울특별시 금천구 — 서울특별시 금천구 옥외광고물 등의 관리와 옥외광고산업 진흥에 관한 조례 (옥외광고물 관리 조례, 시행 20250724)</w:t>
-      </w:r>
-    </w:p>
-    <w:p>
-      <w:pPr>
-        <w:pStyle w:val="ListParagraph"/>
-        <w:numPr>
-          <w:ilvl w:val="0"/>
-          <w:numId w:val="1"/>
-        </w:numPr>
-      </w:pPr>
-      <w:r>
-        <w:t xml:space="preserve">조례 우선순위: secondary / 330점 — 관할 후보 부분 매칭: 서울특별시; 현수막·배너·안내물 조건 후보</w:t>
-      </w:r>
-    </w:p>
-    <w:p>
-      <w:pPr>
-        <w:pStyle w:val="ListParagraph"/>
-        <w:numPr>
-          <w:ilvl w:val="0"/>
-          <w:numId w:val="1"/>
-        </w:numPr>
-      </w:pPr>
-      <w:r>
-        <w:t xml:space="preserve">적용: 행사 홍보·안내를 위해 현수막, 배너, 안내판, 지주형 표시물, 전광류·전기 사용 광고물을 옥외에 표시·설치하는 경우</w:t>
-      </w:r>
-    </w:p>
-    <w:p>
-      <w:pPr>
-        <w:pStyle w:val="ListParagraph"/>
-        <w:numPr>
-          <w:ilvl w:val="0"/>
-          <w:numId w:val="1"/>
-        </w:numPr>
-      </w:pPr>
-      <w:r>
-        <w:t xml:space="preserve">인원/조건: 인원 기준보다 표시 장소, 광고물 종류, 크기, 기간, 전기 사용 여부, 안전점검 대상 여부 확인</w:t>
-      </w:r>
-    </w:p>
-    <w:p>
-      <w:pPr>
-        <w:pStyle w:val="ListParagraph"/>
-        <w:numPr>
-          <w:ilvl w:val="0"/>
-          <w:numId w:val="1"/>
-        </w:numPr>
-      </w:pPr>
-      <w:r>
-        <w:t xml:space="preserve">제출기한: 표시·설치 전 허가/신고 및 게시대 신청 기한을 관할 지자체 기준으로 확인</w:t>
-      </w:r>
-    </w:p>
-    <w:p>
-      <w:pPr>
-        <w:pStyle w:val="ListParagraph"/>
-        <w:numPr>
-          <w:ilvl w:val="0"/>
-          <w:numId w:val="1"/>
-        </w:numPr>
-      </w:pPr>
-      <w:r>
-        <w:t xml:space="preserve">서울특별시 노원구 — 서울특별시 노원구 옥외광고물 등의 관리와 옥외광고산업 진흥에 관한 조례 (옥외광고물 관리 조례, 시행 20241107)</w:t>
-      </w:r>
-    </w:p>
-    <w:p>
-      <w:pPr>
-        <w:pStyle w:val="ListParagraph"/>
-        <w:numPr>
-          <w:ilvl w:val="0"/>
-          <w:numId w:val="1"/>
-        </w:numPr>
-      </w:pPr>
-      <w:r>
-        <w:t xml:space="preserve">조례 우선순위: secondary / 330점 — 관할 후보 부분 매칭: 서울특별시; 현수막·배너·안내물 조건 후보</w:t>
-      </w:r>
-    </w:p>
-    <w:p>
-      <w:pPr>
-        <w:pStyle w:val="ListParagraph"/>
-        <w:numPr>
-          <w:ilvl w:val="0"/>
-          <w:numId w:val="1"/>
-        </w:numPr>
-      </w:pPr>
-      <w:r>
-        <w:t xml:space="preserve">적용: 행사 홍보·안내를 위해 현수막, 배너, 안내판, 지주형 표시물, 전광류·전기 사용 광고물을 옥외에 표시·설치하는 경우</w:t>
-      </w:r>
-    </w:p>
-    <w:p>
-      <w:pPr>
-        <w:pStyle w:val="ListParagraph"/>
-        <w:numPr>
-          <w:ilvl w:val="0"/>
-          <w:numId w:val="1"/>
-        </w:numPr>
-      </w:pPr>
-      <w:r>
-        <w:t xml:space="preserve">인원/조건: 인원 기준보다 표시 장소, 광고물 종류, 크기, 기간, 전기 사용 여부, 안전점검 대상 여부 확인</w:t>
-      </w:r>
-    </w:p>
-    <w:p>
-      <w:pPr>
-        <w:pStyle w:val="ListParagraph"/>
-        <w:numPr>
-          <w:ilvl w:val="0"/>
-          <w:numId w:val="1"/>
-        </w:numPr>
-      </w:pPr>
-      <w:r>
-        <w:t xml:space="preserve">제출기한: 표시·설치 전 허가/신고 및 게시대 신청 기한을 관할 지자체 기준으로 확인</w:t>
-      </w:r>
-    </w:p>
-    <w:p>
-      <w:pPr>
-        <w:pStyle w:val="ListParagraph"/>
-        <w:numPr>
-          <w:ilvl w:val="0"/>
-          <w:numId w:val="1"/>
-        </w:numPr>
-      </w:pPr>
-      <w:r>
-        <w:t xml:space="preserve">서울특별시 도봉구 — 서울특별시 도봉구 옥외광고물 등의 관리와 옥외광고산업 진흥에 관한 조례 (옥외광고물 관리 조례, 시행 20250703)</w:t>
-      </w:r>
-    </w:p>
-    <w:p>
-      <w:pPr>
-        <w:pStyle w:val="ListParagraph"/>
-        <w:numPr>
-          <w:ilvl w:val="0"/>
-          <w:numId w:val="1"/>
-        </w:numPr>
-      </w:pPr>
-      <w:r>
-        <w:t xml:space="preserve">조례 우선순위: secondary / 330점 — 관할 후보 부분 매칭: 서울특별시; 현수막·배너·안내물 조건 후보</w:t>
-      </w:r>
-    </w:p>
-    <w:p>
-      <w:pPr>
-        <w:pStyle w:val="ListParagraph"/>
-        <w:numPr>
-          <w:ilvl w:val="0"/>
-          <w:numId w:val="1"/>
-        </w:numPr>
-      </w:pPr>
-      <w:r>
-        <w:t xml:space="preserve">적용: 행사 홍보·안내를 위해 현수막, 배너, 안내판, 지주형 표시물, 전광류·전기 사용 광고물을 옥외에 표시·설치하는 경우</w:t>
-      </w:r>
-    </w:p>
-    <w:p>
-      <w:pPr>
-        <w:pStyle w:val="ListParagraph"/>
-        <w:numPr>
-          <w:ilvl w:val="0"/>
-          <w:numId w:val="1"/>
-        </w:numPr>
-      </w:pPr>
-      <w:r>
-        <w:t xml:space="preserve">인원/조건: 인원 기준보다 표시 장소, 광고물 종류, 크기, 기간, 전기 사용 여부, 안전점검 대상 여부 확인</w:t>
-      </w:r>
-    </w:p>
-    <w:p>
-      <w:pPr>
-        <w:pStyle w:val="ListParagraph"/>
-        <w:numPr>
-          <w:ilvl w:val="0"/>
-          <w:numId w:val="1"/>
-        </w:numPr>
-      </w:pPr>
-      <w:r>
-        <w:t xml:space="preserve">제출기한: 표시·설치 전 허가/신고 및 게시대 신청 기한을 관할 지자체 기준으로 확인</w:t>
-      </w:r>
-    </w:p>
-    <w:p>
-      <w:pPr>
-        <w:pStyle w:val="ListParagraph"/>
-        <w:numPr>
-          <w:ilvl w:val="0"/>
-          <w:numId w:val="1"/>
-        </w:numPr>
-      </w:pPr>
-      <w:r>
-        <w:t xml:space="preserve">서울특별시 동대문구 — 서울특별시 동대문구 옥외광고물 등의 관리와 옥외광고산업 진흥에 관한 조례 (옥외광고물 관리 조례, 시행 20221103)</w:t>
-      </w:r>
-    </w:p>
-    <w:p>
-      <w:pPr>
-        <w:pStyle w:val="ListParagraph"/>
-        <w:numPr>
-          <w:ilvl w:val="0"/>
-          <w:numId w:val="1"/>
-        </w:numPr>
-      </w:pPr>
-      <w:r>
-        <w:t xml:space="preserve">조례 우선순위: secondary / 330점 — 관할 후보 부분 매칭: 서울특별시; 현수막·배너·안내물 조건 후보</w:t>
-      </w:r>
-    </w:p>
-    <w:p>
-      <w:pPr>
-        <w:pStyle w:val="ListParagraph"/>
-        <w:numPr>
-          <w:ilvl w:val="0"/>
-          <w:numId w:val="1"/>
-        </w:numPr>
-      </w:pPr>
-      <w:r>
-        <w:t xml:space="preserve">적용: 행사 홍보·안내를 위해 현수막, 배너, 안내판, 지주형 표시물, 전광류·전기 사용 광고물을 옥외에 표시·설치하는 경우</w:t>
-      </w:r>
-    </w:p>
-    <w:p>
-      <w:pPr>
-        <w:pStyle w:val="ListParagraph"/>
-        <w:numPr>
-          <w:ilvl w:val="0"/>
-          <w:numId w:val="1"/>
-        </w:numPr>
-      </w:pPr>
-      <w:r>
-        <w:t xml:space="preserve">인원/조건: 인원 기준보다 표시 장소, 광고물 종류, 크기, 기간, 전기 사용 여부, 안전점검 대상 여부 확인</w:t>
-      </w:r>
-    </w:p>
-    <w:p>
-      <w:pPr>
-        <w:pStyle w:val="ListParagraph"/>
-        <w:numPr>
-          <w:ilvl w:val="0"/>
-          <w:numId w:val="1"/>
-        </w:numPr>
-      </w:pPr>
-      <w:r>
-        <w:t xml:space="preserve">제출기한: 표시·설치 전 허가/신고 및 게시대 신청 기한을 관할 지자체 기준으로 확인</w:t>
-      </w:r>
-    </w:p>
-    <w:p>
-      <w:pPr>
-        <w:pStyle w:val="ListParagraph"/>
-        <w:numPr>
-          <w:ilvl w:val="0"/>
-          <w:numId w:val="1"/>
-        </w:numPr>
-      </w:pPr>
-      <w:r>
-        <w:t xml:space="preserve">서울특별시 동작구 — 서울특별시 동작구 옥외광고물 등의 관리와 옥외광고산업 진흥에 관한 조례 (옥외광고물 관리 조례, 시행 20250710)</w:t>
-      </w:r>
-    </w:p>
-    <w:p>
-      <w:pPr>
-        <w:pStyle w:val="ListParagraph"/>
-        <w:numPr>
-          <w:ilvl w:val="0"/>
-          <w:numId w:val="1"/>
-        </w:numPr>
-      </w:pPr>
-      <w:r>
-        <w:t xml:space="preserve">조례 우선순위: secondary / 330점 — 관할 후보 부분 매칭: 서울특별시; 현수막·배너·안내물 조건 후보</w:t>
-      </w:r>
-    </w:p>
-    <w:p>
-      <w:pPr>
-        <w:pStyle w:val="ListParagraph"/>
-        <w:numPr>
-          <w:ilvl w:val="0"/>
-          <w:numId w:val="1"/>
-        </w:numPr>
-      </w:pPr>
-      <w:r>
-        <w:t xml:space="preserve">적용: 행사 홍보·안내를 위해 현수막, 배너, 안내판, 지주형 표시물, 전광류·전기 사용 광고물을 옥외에 표시·설치하는 경우</w:t>
-      </w:r>
-    </w:p>
-    <w:p>
-      <w:pPr>
-        <w:pStyle w:val="ListParagraph"/>
-        <w:numPr>
-          <w:ilvl w:val="0"/>
-          <w:numId w:val="1"/>
-        </w:numPr>
-      </w:pPr>
-      <w:r>
-        <w:t xml:space="preserve">인원/조건: 인원 기준보다 표시 장소, 광고물 종류, 크기, 기간, 전기 사용 여부, 안전점검 대상 여부 확인</w:t>
-      </w:r>
-    </w:p>
-    <w:p>
-      <w:pPr>
-        <w:pStyle w:val="ListParagraph"/>
-        <w:numPr>
-          <w:ilvl w:val="0"/>
-          <w:numId w:val="1"/>
-        </w:numPr>
-      </w:pPr>
-      <w:r>
-        <w:t xml:space="preserve">제출기한: 표시·설치 전 허가/신고 및 게시대 신청 기한을 관할 지자체 기준으로 확인</w:t>
-      </w:r>
-    </w:p>
-    <w:p>
-      <w:pPr>
-        <w:pStyle w:val="ListParagraph"/>
-        <w:numPr>
-          <w:ilvl w:val="0"/>
-          <w:numId w:val="1"/>
-        </w:numPr>
-      </w:pPr>
-      <w:r>
-        <w:t xml:space="preserve">서울특별시 마포구 — 서울특별시 마포구 옥외광고물 등의 관리와 옥외광고산업 진흥에 관한 조례 (옥외광고물 관리 조례, 시행 20251226)</w:t>
-      </w:r>
-    </w:p>
-    <w:p>
-      <w:pPr>
-        <w:pStyle w:val="ListParagraph"/>
-        <w:numPr>
-          <w:ilvl w:val="0"/>
-          <w:numId w:val="1"/>
-        </w:numPr>
-      </w:pPr>
-      <w:r>
-        <w:t xml:space="preserve">조례 우선순위: secondary / 330점 — 관할 후보 부분 매칭: 서울특별시; 현수막·배너·안내물 조건 후보</w:t>
-      </w:r>
-    </w:p>
-    <w:p>
-      <w:pPr>
-        <w:pStyle w:val="ListParagraph"/>
-        <w:numPr>
-          <w:ilvl w:val="0"/>
-          <w:numId w:val="1"/>
-        </w:numPr>
-      </w:pPr>
-      <w:r>
-        <w:t xml:space="preserve">적용: 행사 홍보·안내를 위해 현수막, 배너, 안내판, 지주형 표시물, 전광류·전기 사용 광고물을 옥외에 표시·설치하는 경우</w:t>
-      </w:r>
-    </w:p>
-    <w:p>
-      <w:pPr>
-        <w:pStyle w:val="ListParagraph"/>
-        <w:numPr>
-          <w:ilvl w:val="0"/>
-          <w:numId w:val="1"/>
-        </w:numPr>
-      </w:pPr>
-      <w:r>
-        <w:t xml:space="preserve">인원/조건: 인원 기준보다 표시 장소, 광고물 종류, 크기, 기간, 전기 사용 여부, 안전점검 대상 여부 확인</w:t>
-      </w:r>
-    </w:p>
-    <w:p>
-      <w:pPr>
-        <w:pStyle w:val="ListParagraph"/>
-        <w:numPr>
-          <w:ilvl w:val="0"/>
-          <w:numId w:val="1"/>
-        </w:numPr>
-      </w:pPr>
-      <w:r>
-        <w:t xml:space="preserve">제출기한: 표시·설치 전 허가/신고 및 게시대 신청 기한을 관할 지자체 기준으로 확인</w:t>
-      </w:r>
-    </w:p>
-    <w:p>
-      <w:pPr>
-        <w:pStyle w:val="ListParagraph"/>
-        <w:numPr>
-          <w:ilvl w:val="0"/>
-          <w:numId w:val="1"/>
-        </w:numPr>
-      </w:pPr>
-      <w:r>
-        <w:t xml:space="preserve">서울특별시 서대문구 — 서울특별시 서대문구 옥외광고물 등의 관리와 옥외광고산업 진흥에 관한 조례 (옥외광고물 관리 조례, 시행 20250709)</w:t>
-      </w:r>
-    </w:p>
-    <w:p>
-      <w:pPr>
-        <w:pStyle w:val="ListParagraph"/>
-        <w:numPr>
-          <w:ilvl w:val="0"/>
-          <w:numId w:val="1"/>
-        </w:numPr>
-      </w:pPr>
-      <w:r>
-        <w:t xml:space="preserve">조례 우선순위: secondary / 330점 — 관할 후보 부분 매칭: 서울특별시; 현수막·배너·안내물 조건 후보</w:t>
-      </w:r>
-    </w:p>
-    <w:p>
-      <w:pPr>
-        <w:pStyle w:val="ListParagraph"/>
-        <w:numPr>
-          <w:ilvl w:val="0"/>
-          <w:numId w:val="1"/>
-        </w:numPr>
-      </w:pPr>
-      <w:r>
-        <w:t xml:space="preserve">적용: 행사 홍보·안내를 위해 현수막, 배너, 안내판, 지주형 표시물, 전광류·전기 사용 광고물을 옥외에 표시·설치하는 경우</w:t>
-      </w:r>
-    </w:p>
-    <w:p>
-      <w:pPr>
-        <w:pStyle w:val="ListParagraph"/>
-        <w:numPr>
-          <w:ilvl w:val="0"/>
-          <w:numId w:val="1"/>
-        </w:numPr>
-      </w:pPr>
-      <w:r>
-        <w:t xml:space="preserve">인원/조건: 인원 기준보다 표시 장소, 광고물 종류, 크기, 기간, 전기 사용 여부, 안전점검 대상 여부 확인</w:t>
-      </w:r>
-    </w:p>
-    <w:p>
-      <w:pPr>
-        <w:pStyle w:val="ListParagraph"/>
-        <w:numPr>
-          <w:ilvl w:val="0"/>
-          <w:numId w:val="1"/>
-        </w:numPr>
-      </w:pPr>
-      <w:r>
-        <w:t xml:space="preserve">제출기한: 표시·설치 전 허가/신고 및 게시대 신청 기한을 관할 지자체 기준으로 확인</w:t>
-      </w:r>
-    </w:p>
-    <w:p>
-      <w:pPr>
-        <w:pStyle w:val="ListParagraph"/>
-        <w:numPr>
-          <w:ilvl w:val="0"/>
-          <w:numId w:val="1"/>
-        </w:numPr>
-      </w:pPr>
-      <w:r>
-        <w:t xml:space="preserve">서울특별시 서초구 — 서울특별시 서초구 옥외광고물 등의 관리와 옥외광고산업 진흥에 관한 조례 (옥외광고물 관리 조례, 시행 20231208)</w:t>
-      </w:r>
-    </w:p>
-    <w:p>
-      <w:pPr>
-        <w:pStyle w:val="ListParagraph"/>
-        <w:numPr>
-          <w:ilvl w:val="0"/>
-          <w:numId w:val="1"/>
-        </w:numPr>
-      </w:pPr>
-      <w:r>
-        <w:t xml:space="preserve">조례 우선순위: secondary / 330점 — 관할 후보 부분 매칭: 서울특별시; 현수막·배너·안내물 조건 후보</w:t>
-      </w:r>
-    </w:p>
-    <w:p>
-      <w:pPr>
-        <w:pStyle w:val="ListParagraph"/>
-        <w:numPr>
-          <w:ilvl w:val="0"/>
-          <w:numId w:val="1"/>
-        </w:numPr>
-      </w:pPr>
-      <w:r>
-        <w:t xml:space="preserve">적용: 행사 홍보·안내를 위해 현수막, 배너, 안내판, 지주형 표시물, 전광류·전기 사용 광고물을 옥외에 표시·설치하는 경우</w:t>
-      </w:r>
-    </w:p>
-    <w:p>
-      <w:pPr>
-        <w:pStyle w:val="ListParagraph"/>
-        <w:numPr>
-          <w:ilvl w:val="0"/>
-          <w:numId w:val="1"/>
-        </w:numPr>
-      </w:pPr>
-      <w:r>
-        <w:t xml:space="preserve">인원/조건: 인원 기준보다 표시 장소, 광고물 종류, 크기, 기간, 전기 사용 여부, 안전점검 대상 여부 확인</w:t>
-      </w:r>
-    </w:p>
-    <w:p>
-      <w:pPr>
-        <w:pStyle w:val="ListParagraph"/>
-        <w:numPr>
-          <w:ilvl w:val="0"/>
-          <w:numId w:val="1"/>
-        </w:numPr>
-      </w:pPr>
-      <w:r>
-        <w:t xml:space="preserve">제출기한: 표시·설치 전 허가/신고 및 게시대 신청 기한을 관할 지자체 기준으로 확인</w:t>
-      </w:r>
-    </w:p>
-    <w:p>
-      <w:pPr>
-        <w:pStyle w:val="ListParagraph"/>
-        <w:numPr>
-          <w:ilvl w:val="0"/>
-          <w:numId w:val="1"/>
-        </w:numPr>
-      </w:pPr>
-      <w:r>
-        <w:t xml:space="preserve">서울특별시 성동구 — 서울특별시 성동구 옥외광고물 등의 관리와 옥외광고산업 진흥에 관한 조례 (옥외광고물 관리 조례, 시행 20260504)</w:t>
-      </w:r>
-    </w:p>
-    <w:p>
-      <w:pPr>
-        <w:pStyle w:val="ListParagraph"/>
-        <w:numPr>
-          <w:ilvl w:val="0"/>
-          <w:numId w:val="1"/>
-        </w:numPr>
-      </w:pPr>
-      <w:r>
-        <w:t xml:space="preserve">조례 우선순위: secondary / 330점 — 관할 후보 부분 매칭: 서울특별시; 현수막·배너·안내물 조건 후보</w:t>
-      </w:r>
-    </w:p>
-    <w:p>
-      <w:pPr>
-        <w:pStyle w:val="ListParagraph"/>
-        <w:numPr>
-          <w:ilvl w:val="0"/>
-          <w:numId w:val="1"/>
-        </w:numPr>
-      </w:pPr>
-      <w:r>
-        <w:t xml:space="preserve">적용: 행사 홍보·안내를 위해 현수막, 배너, 안내판, 지주형 표시물, 전광류·전기 사용 광고물을 옥외에 표시·설치하는 경우</w:t>
-      </w:r>
-    </w:p>
-    <w:p>
-      <w:pPr>
-        <w:pStyle w:val="ListParagraph"/>
-        <w:numPr>
-          <w:ilvl w:val="0"/>
-          <w:numId w:val="1"/>
-        </w:numPr>
-      </w:pPr>
-      <w:r>
-        <w:t xml:space="preserve">인원/조건: 인원 기준보다 표시 장소, 광고물 종류, 크기, 기간, 전기 사용 여부, 안전점검 대상 여부 확인</w:t>
-      </w:r>
-    </w:p>
-    <w:p>
-      <w:pPr>
-        <w:pStyle w:val="ListParagraph"/>
-        <w:numPr>
-          <w:ilvl w:val="0"/>
-          <w:numId w:val="1"/>
-        </w:numPr>
-      </w:pPr>
-      <w:r>
-        <w:t xml:space="preserve">제출기한: 표시·설치 전 허가/신고 및 게시대 신청 기한을 관할 지자체 기준으로 확인</w:t>
-      </w:r>
-    </w:p>
-    <w:p>
-      <w:pPr>
-        <w:pStyle w:val="ListParagraph"/>
-        <w:numPr>
-          <w:ilvl w:val="0"/>
-          <w:numId w:val="1"/>
-        </w:numPr>
-      </w:pPr>
-      <w:r>
-        <w:t xml:space="preserve">서울특별시 성북구 — 서울특별시 성북구 옥외광고물 등의 관리와 옥외광고산업진흥에 관한 조례 (옥외광고물 관리 조례, 시행 20241226)</w:t>
-      </w:r>
-    </w:p>
-    <w:p>
-      <w:pPr>
-        <w:pStyle w:val="ListParagraph"/>
-        <w:numPr>
-          <w:ilvl w:val="0"/>
-          <w:numId w:val="1"/>
-        </w:numPr>
-      </w:pPr>
-      <w:r>
-        <w:t xml:space="preserve">조례 우선순위: secondary / 330점 — 관할 후보 부분 매칭: 서울특별시; 현수막·배너·안내물 조건 후보</w:t>
-      </w:r>
-    </w:p>
-    <w:p>
-      <w:pPr>
-        <w:pStyle w:val="ListParagraph"/>
-        <w:numPr>
-          <w:ilvl w:val="0"/>
-          <w:numId w:val="1"/>
-        </w:numPr>
-      </w:pPr>
-      <w:r>
-        <w:t xml:space="preserve">적용: 행사 홍보·안내를 위해 현수막, 배너, 안내판, 지주형 표시물, 전광류·전기 사용 광고물을 옥외에 표시·설치하는 경우</w:t>
-      </w:r>
-    </w:p>
-    <w:p>
-      <w:pPr>
-        <w:pStyle w:val="ListParagraph"/>
-        <w:numPr>
-          <w:ilvl w:val="0"/>
-          <w:numId w:val="1"/>
-        </w:numPr>
-      </w:pPr>
-      <w:r>
-        <w:t xml:space="preserve">인원/조건: 인원 기준보다 표시 장소, 광고물 종류, 크기, 기간, 전기 사용 여부, 안전점검 대상 여부 확인</w:t>
-      </w:r>
-    </w:p>
-    <w:p>
-      <w:pPr>
-        <w:pStyle w:val="ListParagraph"/>
-        <w:numPr>
-          <w:ilvl w:val="0"/>
-          <w:numId w:val="1"/>
-        </w:numPr>
-      </w:pPr>
-      <w:r>
-        <w:t xml:space="preserve">제출기한: 표시·설치 전 허가/신고 및 게시대 신청 기한을 관할 지자체 기준으로 확인</w:t>
-      </w:r>
-    </w:p>
-    <w:p>
-      <w:pPr>
-        <w:pStyle w:val="ListParagraph"/>
-        <w:numPr>
-          <w:ilvl w:val="0"/>
-          <w:numId w:val="1"/>
-        </w:numPr>
-      </w:pPr>
-      <w:r>
-        <w:t xml:space="preserve">서울특별시 송파구 — 서울특별시 송파구 옥외광고물 등의 관리와 옥외광고산업 진흥에 관한 조례 (옥외광고물 관리 조례, 시행 20250410)</w:t>
-      </w:r>
-    </w:p>
-    <w:p>
-      <w:pPr>
-        <w:pStyle w:val="ListParagraph"/>
-        <w:numPr>
-          <w:ilvl w:val="0"/>
-          <w:numId w:val="1"/>
-        </w:numPr>
-      </w:pPr>
-      <w:r>
-        <w:t xml:space="preserve">조례 우선순위: secondary / 330점 — 관할 후보 부분 매칭: 서울특별시; 현수막·배너·안내물 조건 후보</w:t>
-      </w:r>
-    </w:p>
-    <w:p>
-      <w:pPr>
-        <w:pStyle w:val="ListParagraph"/>
-        <w:numPr>
-          <w:ilvl w:val="0"/>
-          <w:numId w:val="1"/>
-        </w:numPr>
-      </w:pPr>
-      <w:r>
-        <w:t xml:space="preserve">적용: 행사 홍보·안내를 위해 현수막, 배너, 안내판, 지주형 표시물, 전광류·전기 사용 광고물을 옥외에 표시·설치하는 경우</w:t>
-      </w:r>
-    </w:p>
-    <w:p>
-      <w:pPr>
-        <w:pStyle w:val="ListParagraph"/>
-        <w:numPr>
-          <w:ilvl w:val="0"/>
-          <w:numId w:val="1"/>
-        </w:numPr>
-      </w:pPr>
-      <w:r>
-        <w:t xml:space="preserve">인원/조건: 인원 기준보다 표시 장소, 광고물 종류, 크기, 기간, 전기 사용 여부, 안전점검 대상 여부 확인</w:t>
-      </w:r>
-    </w:p>
-    <w:p>
-      <w:pPr>
-        <w:pStyle w:val="ListParagraph"/>
-        <w:numPr>
-          <w:ilvl w:val="0"/>
-          <w:numId w:val="1"/>
-        </w:numPr>
-      </w:pPr>
-      <w:r>
-        <w:t xml:space="preserve">제출기한: 표시·설치 전 허가/신고 및 게시대 신청 기한을 관할 지자체 기준으로 확인</w:t>
-      </w:r>
-    </w:p>
-    <w:p>
-      <w:pPr>
-        <w:pStyle w:val="ListParagraph"/>
-        <w:numPr>
-          <w:ilvl w:val="0"/>
-          <w:numId w:val="1"/>
-        </w:numPr>
-      </w:pPr>
-      <w:r>
-        <w:t xml:space="preserve">서울특별시 양천구 — 서울특별시 양천구 옥외광고물 등의 관리와 옥외광고산업 진흥에 관한 조례 (옥외광고물 관리 조례, 시행 20250101)</w:t>
-      </w:r>
-    </w:p>
-    <w:p>
-      <w:pPr>
-        <w:pStyle w:val="ListParagraph"/>
-        <w:numPr>
-          <w:ilvl w:val="0"/>
-          <w:numId w:val="1"/>
-        </w:numPr>
-      </w:pPr>
-      <w:r>
-        <w:t xml:space="preserve">조례 우선순위: secondary / 330점 — 관할 후보 부분 매칭: 서울특별시; 현수막·배너·안내물 조건 후보</w:t>
-      </w:r>
-    </w:p>
-    <w:p>
-      <w:pPr>
-        <w:pStyle w:val="ListParagraph"/>
-        <w:numPr>
-          <w:ilvl w:val="0"/>
-          <w:numId w:val="1"/>
-        </w:numPr>
-      </w:pPr>
-      <w:r>
-        <w:t xml:space="preserve">적용: 행사 홍보·안내를 위해 현수막, 배너, 안내판, 지주형 표시물, 전광류·전기 사용 광고물을 옥외에 표시·설치하는 경우</w:t>
-      </w:r>
-    </w:p>
-    <w:p>
-      <w:pPr>
-        <w:pStyle w:val="ListParagraph"/>
-        <w:numPr>
-          <w:ilvl w:val="0"/>
-          <w:numId w:val="1"/>
-        </w:numPr>
-      </w:pPr>
-      <w:r>
-        <w:t xml:space="preserve">인원/조건: 인원 기준보다 표시 장소, 광고물 종류, 크기, 기간, 전기 사용 여부, 안전점검 대상 여부 확인</w:t>
-      </w:r>
-    </w:p>
-    <w:p>
-      <w:pPr>
-        <w:pStyle w:val="ListParagraph"/>
-        <w:numPr>
-          <w:ilvl w:val="0"/>
-          <w:numId w:val="1"/>
-        </w:numPr>
-      </w:pPr>
-      <w:r>
-        <w:t xml:space="preserve">제출기한: 표시·설치 전 허가/신고 및 게시대 신청 기한을 관할 지자체 기준으로 확인</w:t>
-      </w:r>
-    </w:p>
-    <w:p>
-      <w:pPr>
-        <w:pStyle w:val="ListParagraph"/>
-        <w:numPr>
-          <w:ilvl w:val="0"/>
-          <w:numId w:val="1"/>
-        </w:numPr>
-      </w:pPr>
-      <w:r>
-        <w:t xml:space="preserve">서울특별시 영등포구 — 서울특별시 영등포구 옥외광고물 등의 관리와 옥외광고산업 진흥에 관한 조례 (옥외광고물 관리 조례, 시행 20240101)</w:t>
-      </w:r>
-    </w:p>
-    <w:p>
-      <w:pPr>
-        <w:pStyle w:val="ListParagraph"/>
-        <w:numPr>
-          <w:ilvl w:val="0"/>
-          <w:numId w:val="1"/>
-        </w:numPr>
-      </w:pPr>
-      <w:r>
-        <w:t xml:space="preserve">조례 우선순위: secondary / 330점 — 관할 후보 부분 매칭: 서울특별시; 현수막·배너·안내물 조건 후보</w:t>
-      </w:r>
-    </w:p>
-    <w:p>
-      <w:pPr>
-        <w:pStyle w:val="ListParagraph"/>
-        <w:numPr>
-          <w:ilvl w:val="0"/>
-          <w:numId w:val="1"/>
-        </w:numPr>
-      </w:pPr>
-      <w:r>
-        <w:t xml:space="preserve">적용: 행사 홍보·안내를 위해 현수막, 배너, 안내판, 지주형 표시물, 전광류·전기 사용 광고물을 옥외에 표시·설치하는 경우</w:t>
-      </w:r>
-    </w:p>
-    <w:p>
-      <w:pPr>
-        <w:pStyle w:val="ListParagraph"/>
-        <w:numPr>
-          <w:ilvl w:val="0"/>
-          <w:numId w:val="1"/>
-        </w:numPr>
-      </w:pPr>
-      <w:r>
-        <w:t xml:space="preserve">인원/조건: 인원 기준보다 표시 장소, 광고물 종류, 크기, 기간, 전기 사용 여부, 안전점검 대상 여부 확인</w:t>
-      </w:r>
-    </w:p>
-    <w:p>
-      <w:pPr>
-        <w:pStyle w:val="ListParagraph"/>
-        <w:numPr>
-          <w:ilvl w:val="0"/>
-          <w:numId w:val="1"/>
-        </w:numPr>
-      </w:pPr>
-      <w:r>
-        <w:t xml:space="preserve">제출기한: 표시·설치 전 허가/신고 및 게시대 신청 기한을 관할 지자체 기준으로 확인</w:t>
-      </w:r>
-    </w:p>
-    <w:p>
-      <w:pPr>
-        <w:pStyle w:val="ListParagraph"/>
-        <w:numPr>
-          <w:ilvl w:val="0"/>
-          <w:numId w:val="1"/>
-        </w:numPr>
-      </w:pPr>
-      <w:r>
-        <w:t xml:space="preserve">서울특별시 용산구 — 서울특별시 용산구 옥외광고물 등의 관리와 옥외광고산업 진흥에 관한 조례 (옥외광고물 관리 조례, 시행 20240705)</w:t>
-      </w:r>
-    </w:p>
-    <w:p>
-      <w:pPr>
-        <w:pStyle w:val="ListParagraph"/>
-        <w:numPr>
-          <w:ilvl w:val="0"/>
-          <w:numId w:val="1"/>
-        </w:numPr>
-      </w:pPr>
-      <w:r>
-        <w:t xml:space="preserve">조례 우선순위: secondary / 330점 — 관할 후보 부분 매칭: 서울특별시; 현수막·배너·안내물 조건 후보</w:t>
-      </w:r>
-    </w:p>
-    <w:p>
-      <w:pPr>
-        <w:pStyle w:val="ListParagraph"/>
-        <w:numPr>
-          <w:ilvl w:val="0"/>
-          <w:numId w:val="1"/>
-        </w:numPr>
-      </w:pPr>
-      <w:r>
-        <w:t xml:space="preserve">적용: 행사 홍보·안내를 위해 현수막, 배너, 안내판, 지주형 표시물, 전광류·전기 사용 광고물을 옥외에 표시·설치하는 경우</w:t>
-      </w:r>
-    </w:p>
-    <w:p>
-      <w:pPr>
-        <w:pStyle w:val="ListParagraph"/>
-        <w:numPr>
-          <w:ilvl w:val="0"/>
-          <w:numId w:val="1"/>
-        </w:numPr>
-      </w:pPr>
-      <w:r>
-        <w:t xml:space="preserve">인원/조건: 인원 기준보다 표시 장소, 광고물 종류, 크기, 기간, 전기 사용 여부, 안전점검 대상 여부 확인</w:t>
-      </w:r>
-    </w:p>
-    <w:p>
-      <w:pPr>
-        <w:pStyle w:val="ListParagraph"/>
-        <w:numPr>
-          <w:ilvl w:val="0"/>
-          <w:numId w:val="1"/>
-        </w:numPr>
-      </w:pPr>
-      <w:r>
-        <w:t xml:space="preserve">제출기한: 표시·설치 전 허가/신고 및 게시대 신청 기한을 관할 지자체 기준으로 확인</w:t>
-      </w:r>
-    </w:p>
-    <w:p>
-      <w:pPr>
-        <w:pStyle w:val="ListParagraph"/>
-        <w:numPr>
-          <w:ilvl w:val="0"/>
-          <w:numId w:val="1"/>
-        </w:numPr>
-      </w:pPr>
-      <w:r>
-        <w:t xml:space="preserve">서울특별시 은평구 — 서울특별시 은평구 옥외광고물 등의 관리와 옥외광고산업 진흥에 관한 조례 (옥외광고물 관리 조례, 시행 20251226)</w:t>
-      </w:r>
-    </w:p>
-    <w:p>
-      <w:pPr>
-        <w:pStyle w:val="ListParagraph"/>
-        <w:numPr>
-          <w:ilvl w:val="0"/>
-          <w:numId w:val="1"/>
-        </w:numPr>
-      </w:pPr>
-      <w:r>
-        <w:t xml:space="preserve">조례 우선순위: secondary / 330점 — 관할 후보 부분 매칭: 서울특별시; 현수막·배너·안내물 조건 후보</w:t>
-      </w:r>
-    </w:p>
-    <w:p>
-      <w:pPr>
-        <w:pStyle w:val="ListParagraph"/>
-        <w:numPr>
-          <w:ilvl w:val="0"/>
-          <w:numId w:val="1"/>
-        </w:numPr>
-      </w:pPr>
-      <w:r>
-        <w:t xml:space="preserve">적용: 행사 홍보·안내를 위해 현수막, 배너, 안내판, 지주형 표시물, 전광류·전기 사용 광고물을 옥외에 표시·설치하는 경우</w:t>
-      </w:r>
-    </w:p>
-    <w:p>
-      <w:pPr>
-        <w:pStyle w:val="ListParagraph"/>
-        <w:numPr>
-          <w:ilvl w:val="0"/>
-          <w:numId w:val="1"/>
-        </w:numPr>
-      </w:pPr>
-      <w:r>
-        <w:t xml:space="preserve">인원/조건: 인원 기준보다 표시 장소, 광고물 종류, 크기, 기간, 전기 사용 여부, 안전점검 대상 여부 확인</w:t>
-      </w:r>
-    </w:p>
-    <w:p>
-      <w:pPr>
-        <w:pStyle w:val="ListParagraph"/>
-        <w:numPr>
-          <w:ilvl w:val="0"/>
-          <w:numId w:val="1"/>
-        </w:numPr>
-      </w:pPr>
-      <w:r>
-        <w:t xml:space="preserve">제출기한: 표시·설치 전 허가/신고 및 게시대 신청 기한을 관할 지자체 기준으로 확인</w:t>
-      </w:r>
-    </w:p>
-    <w:p>
-      <w:pPr>
-        <w:pStyle w:val="ListParagraph"/>
-        <w:numPr>
-          <w:ilvl w:val="0"/>
-          <w:numId w:val="1"/>
-        </w:numPr>
-      </w:pPr>
-      <w:r>
-        <w:t xml:space="preserve">서울특별시 종로구 — 서울특별시 종로구 옥외광고물 등의 관리와 옥외광고산업 진흥에 관한 조례 (옥외광고물 관리 조례, 시행 20240517)</w:t>
-      </w:r>
-    </w:p>
-    <w:p>
-      <w:pPr>
-        <w:pStyle w:val="ListParagraph"/>
-        <w:numPr>
-          <w:ilvl w:val="0"/>
-          <w:numId w:val="1"/>
-        </w:numPr>
-      </w:pPr>
-      <w:r>
-        <w:t xml:space="preserve">조례 우선순위: secondary / 330점 — 관할 후보 부분 매칭: 서울특별시; 현수막·배너·안내물 조건 후보</w:t>
-      </w:r>
-    </w:p>
-    <w:p>
-      <w:pPr>
-        <w:pStyle w:val="ListParagraph"/>
-        <w:numPr>
-          <w:ilvl w:val="0"/>
-          <w:numId w:val="1"/>
-        </w:numPr>
-      </w:pPr>
-      <w:r>
-        <w:t xml:space="preserve">적용: 행사 홍보·안내를 위해 현수막, 배너, 안내판, 지주형 표시물, 전광류·전기 사용 광고물을 옥외에 표시·설치하는 경우</w:t>
-      </w:r>
-    </w:p>
-    <w:p>
-      <w:pPr>
-        <w:pStyle w:val="ListParagraph"/>
-        <w:numPr>
-          <w:ilvl w:val="0"/>
-          <w:numId w:val="1"/>
-        </w:numPr>
-      </w:pPr>
-      <w:r>
-        <w:t xml:space="preserve">인원/조건: 인원 기준보다 표시 장소, 광고물 종류, 크기, 기간, 전기 사용 여부, 안전점검 대상 여부 확인</w:t>
-      </w:r>
-    </w:p>
-    <w:p>
-      <w:pPr>
-        <w:pStyle w:val="ListParagraph"/>
-        <w:numPr>
-          <w:ilvl w:val="0"/>
-          <w:numId w:val="1"/>
-        </w:numPr>
-      </w:pPr>
-      <w:r>
-        <w:t xml:space="preserve">제출기한: 표시·설치 전 허가/신고 및 게시대 신청 기한을 관할 지자체 기준으로 확인</w:t>
-      </w:r>
-    </w:p>
-    <w:p>
-      <w:pPr>
-        <w:pStyle w:val="ListParagraph"/>
-        <w:numPr>
-          <w:ilvl w:val="0"/>
-          <w:numId w:val="1"/>
-        </w:numPr>
-      </w:pPr>
-      <w:r>
-        <w:t xml:space="preserve">서울특별시 중구 — 서울특별시 중구 옥외광고물 등의 관리와 옥외광고산업 진흥에 관한 조례 (옥외광고물 관리 조례, 시행 20241231)</w:t>
-      </w:r>
-    </w:p>
-    <w:p>
-      <w:pPr>
-        <w:pStyle w:val="ListParagraph"/>
-        <w:numPr>
-          <w:ilvl w:val="0"/>
-          <w:numId w:val="1"/>
-        </w:numPr>
-      </w:pPr>
-      <w:r>
-        <w:t xml:space="preserve">조례 우선순위: secondary / 330점 — 관할 후보 부분 매칭: 서울특별시; 현수막·배너·안내물 조건 후보</w:t>
-      </w:r>
-    </w:p>
-    <w:p>
-      <w:pPr>
-        <w:pStyle w:val="ListParagraph"/>
-        <w:numPr>
-          <w:ilvl w:val="0"/>
-          <w:numId w:val="1"/>
-        </w:numPr>
-      </w:pPr>
-      <w:r>
-        <w:t xml:space="preserve">적용: 행사 홍보·안내를 위해 현수막, 배너, 안내판, 지주형 표시물, 전광류·전기 사용 광고물을 옥외에 표시·설치하는 경우</w:t>
-      </w:r>
-    </w:p>
-    <w:p>
-      <w:pPr>
-        <w:pStyle w:val="ListParagraph"/>
-        <w:numPr>
-          <w:ilvl w:val="0"/>
-          <w:numId w:val="1"/>
-        </w:numPr>
-      </w:pPr>
-      <w:r>
-        <w:t xml:space="preserve">인원/조건: 인원 기준보다 표시 장소, 광고물 종류, 크기, 기간, 전기 사용 여부, 안전점검 대상 여부 확인</w:t>
-      </w:r>
-    </w:p>
-    <w:p>
-      <w:pPr>
-        <w:pStyle w:val="ListParagraph"/>
-        <w:numPr>
-          <w:ilvl w:val="0"/>
-          <w:numId w:val="1"/>
-        </w:numPr>
-      </w:pPr>
-      <w:r>
-        <w:t xml:space="preserve">제출기한: 표시·설치 전 허가/신고 및 게시대 신청 기한을 관할 지자체 기준으로 확인</w:t>
-      </w:r>
-    </w:p>
-    <w:p>
-      <w:pPr>
-        <w:pStyle w:val="ListParagraph"/>
-        <w:numPr>
-          <w:ilvl w:val="0"/>
-          <w:numId w:val="1"/>
-        </w:numPr>
-      </w:pPr>
-      <w:r>
-        <w:t xml:space="preserve">서울특별시 중랑구 — 서울특별시 중랑구 옥외광고물 등의 관리와 옥외광고산업 진흥에 관한 조례 (옥외광고물 관리 조례, 시행 20231005)</w:t>
-      </w:r>
-    </w:p>
-    <w:p>
-      <w:pPr>
-        <w:pStyle w:val="ListParagraph"/>
-        <w:numPr>
-          <w:ilvl w:val="0"/>
-          <w:numId w:val="1"/>
-        </w:numPr>
-      </w:pPr>
-      <w:r>
-        <w:t xml:space="preserve">조례 우선순위: secondary / 330점 — 관할 후보 부분 매칭: 서울특별시; 현수막·배너·안내물 조건 후보</w:t>
-      </w:r>
-    </w:p>
-    <w:p>
-      <w:pPr>
-        <w:pStyle w:val="ListParagraph"/>
-        <w:numPr>
-          <w:ilvl w:val="0"/>
-          <w:numId w:val="1"/>
-        </w:numPr>
-      </w:pPr>
-      <w:r>
-        <w:t xml:space="preserve">적용: 행사 홍보·안내를 위해 현수막, 배너, 안내판, 지주형 표시물, 전광류·전기 사용 광고물을 옥외에 표시·설치하는 경우</w:t>
-      </w:r>
-    </w:p>
-    <w:p>
-      <w:pPr>
-        <w:pStyle w:val="ListParagraph"/>
-        <w:numPr>
-          <w:ilvl w:val="0"/>
-          <w:numId w:val="1"/>
-        </w:numPr>
-      </w:pPr>
-      <w:r>
-        <w:t xml:space="preserve">인원/조건: 인원 기준보다 표시 장소, 광고물 종류, 크기, 기간, 전기 사용 여부, 안전점검 대상 여부 확인</w:t>
-      </w:r>
-    </w:p>
-    <w:p>
-      <w:pPr>
-        <w:pStyle w:val="ListParagraph"/>
-        <w:numPr>
-          <w:ilvl w:val="0"/>
-          <w:numId w:val="1"/>
-        </w:numPr>
-      </w:pPr>
-      <w:r>
-        <w:t xml:space="preserve">제출기한: 표시·설치 전 허가/신고 및 게시대 신청 기한을 관할 지자체 기준으로 확인</w:t>
+        <w:t xml:space="preserve">우선 적용 조례 후보 없음. 관할 지자체와 베뉴 소재지를 확인하세요</w:t>
       </w:r>
     </w:p>
     <w:p/>
@@ -4380,498 +2820,6 @@
         <w:t xml:space="preserve">승강기 안전관리법 (승강기안전법): 제31조 승강기의 자체점검</w:t>
       </w:r>
     </w:p>
-    <w:p>
-      <w:pPr>
-        <w:pStyle w:val="ListParagraph"/>
-        <w:numPr>
-          <w:ilvl w:val="0"/>
-          <w:numId w:val="1"/>
-        </w:numPr>
-      </w:pPr>
-      <w:r>
-        <w:t xml:space="preserve">서울특별시 — 서울특별시 옥외광고물 등의 관리와 옥외광고산업 진흥에 관한 조례 (옥외광고물 관리 조례, 시행 20260518)</w:t>
-      </w:r>
-    </w:p>
-    <w:p>
-      <w:pPr>
-        <w:pStyle w:val="ListParagraph"/>
-        <w:numPr>
-          <w:ilvl w:val="0"/>
-          <w:numId w:val="1"/>
-        </w:numPr>
-      </w:pPr>
-      <w:r>
-        <w:t xml:space="preserve">조례 우선순위: primary / 610점 — 관할 지자체 정확 매칭: 서울특별시; 현수막·배너·안내물 조건 후보; 조문 발췌 보유</w:t>
-      </w:r>
-    </w:p>
-    <w:p>
-      <w:pPr>
-        <w:pStyle w:val="ListParagraph"/>
-        <w:numPr>
-          <w:ilvl w:val="0"/>
-          <w:numId w:val="1"/>
-        </w:numPr>
-      </w:pPr>
-      <w:r>
-        <w:t xml:space="preserve">적용: 행사 홍보·안내를 위해 현수막, 배너, 안내판, 지주형 표시물, 전광류·전기 사용 광고물을 옥외에 표시·설치하는 경우</w:t>
-      </w:r>
-    </w:p>
-    <w:p>
-      <w:pPr>
-        <w:pStyle w:val="ListParagraph"/>
-        <w:numPr>
-          <w:ilvl w:val="0"/>
-          <w:numId w:val="1"/>
-        </w:numPr>
-      </w:pPr>
-      <w:r>
-        <w:t xml:space="preserve">인원/조건: 인원 기준보다 표시 장소, 광고물 종류, 크기, 기간, 전기 사용 여부, 안전점검 대상 여부 확인</w:t>
-      </w:r>
-    </w:p>
-    <w:p>
-      <w:pPr>
-        <w:pStyle w:val="ListParagraph"/>
-        <w:numPr>
-          <w:ilvl w:val="0"/>
-          <w:numId w:val="1"/>
-        </w:numPr>
-      </w:pPr>
-      <w:r>
-        <w:t xml:space="preserve">제출기한: 표시·설치 전 허가/신고 및 게시대 신청 기한을 관할 지자체 기준으로 확인</w:t>
-      </w:r>
-    </w:p>
-    <w:p>
-      <w:pPr>
-        <w:pStyle w:val="ListParagraph"/>
-        <w:numPr>
-          <w:ilvl w:val="0"/>
-          <w:numId w:val="1"/>
-        </w:numPr>
-      </w:pPr>
-      <w:r>
-        <w:t xml:space="preserve">핵심 발췌: 목적: 제1조(목적) 이 조례는 「옥외광고물 등의 관리와 옥외광고산업 진흥에 관한 법률」 및 같은 법 시행령에서 위임된 사항과 그 시행에 관하여 필요한 사항을 규정함을 목적으로 한다.[전문개정 2025.5.19]</w:t>
-      </w:r>
-    </w:p>
-    <w:p>
-      <w:pPr>
-        <w:pStyle w:val="ListParagraph"/>
-        <w:numPr>
-          <w:ilvl w:val="0"/>
-          <w:numId w:val="1"/>
-        </w:numPr>
-      </w:pPr>
-      <w:r>
-        <w:t xml:space="preserve">서울특별시 강남구 — 서울특별시 강남구 옥외광고물 등의 관리와 옥외광고산업 진흥에 관한 조례 (옥외광고물 관리 조례, 시행 20250321)</w:t>
-      </w:r>
-    </w:p>
-    <w:p>
-      <w:pPr>
-        <w:pStyle w:val="ListParagraph"/>
-        <w:numPr>
-          <w:ilvl w:val="0"/>
-          <w:numId w:val="1"/>
-        </w:numPr>
-      </w:pPr>
-      <w:r>
-        <w:t xml:space="preserve">조례 우선순위: primary / 580점 — 관할 지자체 정확 매칭: 서울특별시 강남구; 현수막·배너·안내물 조건 후보</w:t>
-      </w:r>
-    </w:p>
-    <w:p>
-      <w:pPr>
-        <w:pStyle w:val="ListParagraph"/>
-        <w:numPr>
-          <w:ilvl w:val="0"/>
-          <w:numId w:val="1"/>
-        </w:numPr>
-      </w:pPr>
-      <w:r>
-        <w:t xml:space="preserve">적용: 행사 홍보·안내를 위해 현수막, 배너, 안내판, 지주형 표시물, 전광류·전기 사용 광고물을 옥외에 표시·설치하는 경우</w:t>
-      </w:r>
-    </w:p>
-    <w:p>
-      <w:pPr>
-        <w:pStyle w:val="ListParagraph"/>
-        <w:numPr>
-          <w:ilvl w:val="0"/>
-          <w:numId w:val="1"/>
-        </w:numPr>
-      </w:pPr>
-      <w:r>
-        <w:t xml:space="preserve">인원/조건: 인원 기준보다 표시 장소, 광고물 종류, 크기, 기간, 전기 사용 여부, 안전점검 대상 여부 확인</w:t>
-      </w:r>
-    </w:p>
-    <w:p>
-      <w:pPr>
-        <w:pStyle w:val="ListParagraph"/>
-        <w:numPr>
-          <w:ilvl w:val="0"/>
-          <w:numId w:val="1"/>
-        </w:numPr>
-      </w:pPr>
-      <w:r>
-        <w:t xml:space="preserve">제출기한: 표시·설치 전 허가/신고 및 게시대 신청 기한을 관할 지자체 기준으로 확인</w:t>
-      </w:r>
-    </w:p>
-    <w:p>
-      <w:pPr>
-        <w:pStyle w:val="ListParagraph"/>
-        <w:numPr>
-          <w:ilvl w:val="0"/>
-          <w:numId w:val="1"/>
-        </w:numPr>
-      </w:pPr>
-      <w:r>
-        <w:t xml:space="preserve">서울특별시 강동구 — 서울특별시 강동구 옥외광고물 등의 관리와 옥외광고산업 진흥에 관한 조례 (옥외광고물 관리 조례, 시행 20230705)</w:t>
-      </w:r>
-    </w:p>
-    <w:p>
-      <w:pPr>
-        <w:pStyle w:val="ListParagraph"/>
-        <w:numPr>
-          <w:ilvl w:val="0"/>
-          <w:numId w:val="1"/>
-        </w:numPr>
-      </w:pPr>
-      <w:r>
-        <w:t xml:space="preserve">조례 우선순위: secondary / 330점 — 관할 후보 부분 매칭: 서울특별시; 현수막·배너·안내물 조건 후보</w:t>
-      </w:r>
-    </w:p>
-    <w:p>
-      <w:pPr>
-        <w:pStyle w:val="ListParagraph"/>
-        <w:numPr>
-          <w:ilvl w:val="0"/>
-          <w:numId w:val="1"/>
-        </w:numPr>
-      </w:pPr>
-      <w:r>
-        <w:t xml:space="preserve">적용: 행사 홍보·안내를 위해 현수막, 배너, 안내판, 지주형 표시물, 전광류·전기 사용 광고물을 옥외에 표시·설치하는 경우</w:t>
-      </w:r>
-    </w:p>
-    <w:p>
-      <w:pPr>
-        <w:pStyle w:val="ListParagraph"/>
-        <w:numPr>
-          <w:ilvl w:val="0"/>
-          <w:numId w:val="1"/>
-        </w:numPr>
-      </w:pPr>
-      <w:r>
-        <w:t xml:space="preserve">인원/조건: 인원 기준보다 표시 장소, 광고물 종류, 크기, 기간, 전기 사용 여부, 안전점검 대상 여부 확인</w:t>
-      </w:r>
-    </w:p>
-    <w:p>
-      <w:pPr>
-        <w:pStyle w:val="ListParagraph"/>
-        <w:numPr>
-          <w:ilvl w:val="0"/>
-          <w:numId w:val="1"/>
-        </w:numPr>
-      </w:pPr>
-      <w:r>
-        <w:t xml:space="preserve">제출기한: 표시·설치 전 허가/신고 및 게시대 신청 기한을 관할 지자체 기준으로 확인</w:t>
-      </w:r>
-    </w:p>
-    <w:p>
-      <w:pPr>
-        <w:pStyle w:val="ListParagraph"/>
-        <w:numPr>
-          <w:ilvl w:val="0"/>
-          <w:numId w:val="1"/>
-        </w:numPr>
-      </w:pPr>
-      <w:r>
-        <w:t xml:space="preserve">서울특별시 강북구 — 서울특별시 강북구 옥외광고물 등의 관리와 옥외광고산업 진흥에 관한 조례 (옥외광고물 관리 조례, 시행 20241101)</w:t>
-      </w:r>
-    </w:p>
-    <w:p>
-      <w:pPr>
-        <w:pStyle w:val="ListParagraph"/>
-        <w:numPr>
-          <w:ilvl w:val="0"/>
-          <w:numId w:val="1"/>
-        </w:numPr>
-      </w:pPr>
-      <w:r>
-        <w:t xml:space="preserve">조례 우선순위: secondary / 330점 — 관할 후보 부분 매칭: 서울특별시; 현수막·배너·안내물 조건 후보</w:t>
-      </w:r>
-    </w:p>
-    <w:p>
-      <w:pPr>
-        <w:pStyle w:val="ListParagraph"/>
-        <w:numPr>
-          <w:ilvl w:val="0"/>
-          <w:numId w:val="1"/>
-        </w:numPr>
-      </w:pPr>
-      <w:r>
-        <w:t xml:space="preserve">적용: 행사 홍보·안내를 위해 현수막, 배너, 안내판, 지주형 표시물, 전광류·전기 사용 광고물을 옥외에 표시·설치하는 경우</w:t>
-      </w:r>
-    </w:p>
-    <w:p>
-      <w:pPr>
-        <w:pStyle w:val="ListParagraph"/>
-        <w:numPr>
-          <w:ilvl w:val="0"/>
-          <w:numId w:val="1"/>
-        </w:numPr>
-      </w:pPr>
-      <w:r>
-        <w:t xml:space="preserve">인원/조건: 인원 기준보다 표시 장소, 광고물 종류, 크기, 기간, 전기 사용 여부, 안전점검 대상 여부 확인</w:t>
-      </w:r>
-    </w:p>
-    <w:p>
-      <w:pPr>
-        <w:pStyle w:val="ListParagraph"/>
-        <w:numPr>
-          <w:ilvl w:val="0"/>
-          <w:numId w:val="1"/>
-        </w:numPr>
-      </w:pPr>
-      <w:r>
-        <w:t xml:space="preserve">제출기한: 표시·설치 전 허가/신고 및 게시대 신청 기한을 관할 지자체 기준으로 확인</w:t>
-      </w:r>
-    </w:p>
-    <w:p>
-      <w:pPr>
-        <w:pStyle w:val="ListParagraph"/>
-        <w:numPr>
-          <w:ilvl w:val="0"/>
-          <w:numId w:val="1"/>
-        </w:numPr>
-      </w:pPr>
-      <w:r>
-        <w:t xml:space="preserve">서울특별시 강서구 — 서울특별시 강서구 옥외광고물 등의 관리와 옥외광고산업 진흥에 관한 조례 (옥외광고물 관리 조례, 시행 20251001)</w:t>
-      </w:r>
-    </w:p>
-    <w:p>
-      <w:pPr>
-        <w:pStyle w:val="ListParagraph"/>
-        <w:numPr>
-          <w:ilvl w:val="0"/>
-          <w:numId w:val="1"/>
-        </w:numPr>
-      </w:pPr>
-      <w:r>
-        <w:t xml:space="preserve">조례 우선순위: secondary / 330점 — 관할 후보 부분 매칭: 서울특별시; 현수막·배너·안내물 조건 후보</w:t>
-      </w:r>
-    </w:p>
-    <w:p>
-      <w:pPr>
-        <w:pStyle w:val="ListParagraph"/>
-        <w:numPr>
-          <w:ilvl w:val="0"/>
-          <w:numId w:val="1"/>
-        </w:numPr>
-      </w:pPr>
-      <w:r>
-        <w:t xml:space="preserve">적용: 행사 홍보·안내를 위해 현수막, 배너, 안내판, 지주형 표시물, 전광류·전기 사용 광고물을 옥외에 표시·설치하는 경우</w:t>
-      </w:r>
-    </w:p>
-    <w:p>
-      <w:pPr>
-        <w:pStyle w:val="ListParagraph"/>
-        <w:numPr>
-          <w:ilvl w:val="0"/>
-          <w:numId w:val="1"/>
-        </w:numPr>
-      </w:pPr>
-      <w:r>
-        <w:t xml:space="preserve">인원/조건: 인원 기준보다 표시 장소, 광고물 종류, 크기, 기간, 전기 사용 여부, 안전점검 대상 여부 확인</w:t>
-      </w:r>
-    </w:p>
-    <w:p>
-      <w:pPr>
-        <w:pStyle w:val="ListParagraph"/>
-        <w:numPr>
-          <w:ilvl w:val="0"/>
-          <w:numId w:val="1"/>
-        </w:numPr>
-      </w:pPr>
-      <w:r>
-        <w:t xml:space="preserve">제출기한: 표시·설치 전 허가/신고 및 게시대 신청 기한을 관할 지자체 기준으로 확인</w:t>
-      </w:r>
-    </w:p>
-    <w:p>
-      <w:pPr>
-        <w:pStyle w:val="ListParagraph"/>
-        <w:numPr>
-          <w:ilvl w:val="0"/>
-          <w:numId w:val="1"/>
-        </w:numPr>
-      </w:pPr>
-      <w:r>
-        <w:t xml:space="preserve">서울특별시 관악구 — 서울특별시 관악구 옥외광고물 등의 관리와 옥외광고산업 진흥에 관한 조례 (옥외광고물 관리 조례, 시행 20240411)</w:t>
-      </w:r>
-    </w:p>
-    <w:p>
-      <w:pPr>
-        <w:pStyle w:val="ListParagraph"/>
-        <w:numPr>
-          <w:ilvl w:val="0"/>
-          <w:numId w:val="1"/>
-        </w:numPr>
-      </w:pPr>
-      <w:r>
-        <w:t xml:space="preserve">조례 우선순위: secondary / 330점 — 관할 후보 부분 매칭: 서울특별시; 현수막·배너·안내물 조건 후보</w:t>
-      </w:r>
-    </w:p>
-    <w:p>
-      <w:pPr>
-        <w:pStyle w:val="ListParagraph"/>
-        <w:numPr>
-          <w:ilvl w:val="0"/>
-          <w:numId w:val="1"/>
-        </w:numPr>
-      </w:pPr>
-      <w:r>
-        <w:t xml:space="preserve">적용: 행사 홍보·안내를 위해 현수막, 배너, 안내판, 지주형 표시물, 전광류·전기 사용 광고물을 옥외에 표시·설치하는 경우</w:t>
-      </w:r>
-    </w:p>
-    <w:p>
-      <w:pPr>
-        <w:pStyle w:val="ListParagraph"/>
-        <w:numPr>
-          <w:ilvl w:val="0"/>
-          <w:numId w:val="1"/>
-        </w:numPr>
-      </w:pPr>
-      <w:r>
-        <w:t xml:space="preserve">인원/조건: 인원 기준보다 표시 장소, 광고물 종류, 크기, 기간, 전기 사용 여부, 안전점검 대상 여부 확인</w:t>
-      </w:r>
-    </w:p>
-    <w:p>
-      <w:pPr>
-        <w:pStyle w:val="ListParagraph"/>
-        <w:numPr>
-          <w:ilvl w:val="0"/>
-          <w:numId w:val="1"/>
-        </w:numPr>
-      </w:pPr>
-      <w:r>
-        <w:t xml:space="preserve">제출기한: 표시·설치 전 허가/신고 및 게시대 신청 기한을 관할 지자체 기준으로 확인</w:t>
-      </w:r>
-    </w:p>
-    <w:p>
-      <w:pPr>
-        <w:pStyle w:val="ListParagraph"/>
-        <w:numPr>
-          <w:ilvl w:val="0"/>
-          <w:numId w:val="1"/>
-        </w:numPr>
-      </w:pPr>
-      <w:r>
-        <w:t xml:space="preserve">서울특별시 광진구 — 서울특별시 광진구 옥외광고물 등의 관리와 옥외광고산업 진흥에 관한 조례 (옥외광고물 관리 조례, 시행 20250228)</w:t>
-      </w:r>
-    </w:p>
-    <w:p>
-      <w:pPr>
-        <w:pStyle w:val="ListParagraph"/>
-        <w:numPr>
-          <w:ilvl w:val="0"/>
-          <w:numId w:val="1"/>
-        </w:numPr>
-      </w:pPr>
-      <w:r>
-        <w:t xml:space="preserve">조례 우선순위: secondary / 330점 — 관할 후보 부분 매칭: 서울특별시; 현수막·배너·안내물 조건 후보</w:t>
-      </w:r>
-    </w:p>
-    <w:p>
-      <w:pPr>
-        <w:pStyle w:val="ListParagraph"/>
-        <w:numPr>
-          <w:ilvl w:val="0"/>
-          <w:numId w:val="1"/>
-        </w:numPr>
-      </w:pPr>
-      <w:r>
-        <w:t xml:space="preserve">적용: 행사 홍보·안내를 위해 현수막, 배너, 안내판, 지주형 표시물, 전광류·전기 사용 광고물을 옥외에 표시·설치하는 경우</w:t>
-      </w:r>
-    </w:p>
-    <w:p>
-      <w:pPr>
-        <w:pStyle w:val="ListParagraph"/>
-        <w:numPr>
-          <w:ilvl w:val="0"/>
-          <w:numId w:val="1"/>
-        </w:numPr>
-      </w:pPr>
-      <w:r>
-        <w:t xml:space="preserve">인원/조건: 인원 기준보다 표시 장소, 광고물 종류, 크기, 기간, 전기 사용 여부, 안전점검 대상 여부 확인</w:t>
-      </w:r>
-    </w:p>
-    <w:p>
-      <w:pPr>
-        <w:pStyle w:val="ListParagraph"/>
-        <w:numPr>
-          <w:ilvl w:val="0"/>
-          <w:numId w:val="1"/>
-        </w:numPr>
-      </w:pPr>
-      <w:r>
-        <w:t xml:space="preserve">제출기한: 표시·설치 전 허가/신고 및 게시대 신청 기한을 관할 지자체 기준으로 확인</w:t>
-      </w:r>
-    </w:p>
-    <w:p>
-      <w:pPr>
-        <w:pStyle w:val="ListParagraph"/>
-        <w:numPr>
-          <w:ilvl w:val="0"/>
-          <w:numId w:val="1"/>
-        </w:numPr>
-      </w:pPr>
-      <w:r>
-        <w:t xml:space="preserve">서울특별시 구로구 — 서울특별시 구로구 옥외광고물 등의 관리와 옥외광고산업 진흥에 관한 조례 (옥외광고물 관리 조례, 시행 20250306)</w:t>
-      </w:r>
-    </w:p>
-    <w:p>
-      <w:pPr>
-        <w:pStyle w:val="ListParagraph"/>
-        <w:numPr>
-          <w:ilvl w:val="0"/>
-          <w:numId w:val="1"/>
-        </w:numPr>
-      </w:pPr>
-      <w:r>
-        <w:t xml:space="preserve">조례 우선순위: secondary / 330점 — 관할 후보 부분 매칭: 서울특별시; 현수막·배너·안내물 조건 후보</w:t>
-      </w:r>
-    </w:p>
-    <w:p>
-      <w:pPr>
-        <w:pStyle w:val="ListParagraph"/>
-        <w:numPr>
-          <w:ilvl w:val="0"/>
-          <w:numId w:val="1"/>
-        </w:numPr>
-      </w:pPr>
-      <w:r>
-        <w:t xml:space="preserve">적용: 행사 홍보·안내를 위해 현수막, 배너, 안내판, 지주형 표시물, 전광류·전기 사용 광고물을 옥외에 표시·설치하는 경우</w:t>
-      </w:r>
-    </w:p>
-    <w:p>
-      <w:pPr>
-        <w:pStyle w:val="ListParagraph"/>
-        <w:numPr>
-          <w:ilvl w:val="0"/>
-          <w:numId w:val="1"/>
-        </w:numPr>
-      </w:pPr>
-      <w:r>
-        <w:t xml:space="preserve">인원/조건: 인원 기준보다 표시 장소, 광고물 종류, 크기, 기간, 전기 사용 여부, 안전점검 대상 여부 확인</w:t>
-      </w:r>
-    </w:p>
-    <w:p>
-      <w:pPr>
-        <w:pStyle w:val="ListParagraph"/>
-        <w:numPr>
-          <w:ilvl w:val="0"/>
-          <w:numId w:val="1"/>
-        </w:numPr>
-      </w:pPr>
-      <w:r>
-        <w:t xml:space="preserve">제출기한: 표시·설치 전 허가/신고 및 게시대 신청 기한을 관할 지자체 기준으로 확인</w:t>
-      </w:r>
-    </w:p>
     <w:p/>
     <w:p>
       <w:pPr>
@@ -9029,11 +6977,6 @@
     </w:p>
     <w:p>
       <w:r>
-        <w:t xml:space="preserve">| 개장 전 | 개장 T-75 | 2026-05-12 | 출입통제·VIP·보안검색 | 보안검색 위치, 검색 예외, VIP 동선, 경비원 명부, 경찰·베뉴 보안실 연락 기준 확인 | 보안팀장 | 보안 배치표/명부/무전망 | 경찰/안전총괄 |</w:t>
-      </w:r>
-    </w:p>
-    <w:p>
-      <w:r>
         <w:t xml:space="preserve">| 개장 전 | 개장 T-60 | 2026-05-12 | 등록·CCTV·촬영 | 개인정보 고지, CCTV 안내판, 촬영 고지, 현장 단말 잠금, 접근권한, 접속기록 담당 확인 | 개인정보보호책임자 | 고지문/안내판 사진/권한 점검표 | 운영총괄/보안책임자 |</w:t>
       </w:r>
     </w:p>
@@ -9104,42 +7047,32 @@
     </w:p>
     <w:p>
       <w:r>
-        <w:t xml:space="preserve">| 1 | 옥외광고 담당부서/베뉴 | 현수막·배너·안내판·전기 광고물 허가/신고 | 옥외 임시 안내물, 지주형 표시물, 전광류 또는 전기 사용 광고물을 설치하는 경우 | 표시·설치 전 | 옥외광고물법 시행령 제5·7·12·14조와 관할 조례 확인 | open |</w:t>
-      </w:r>
-    </w:p>
-    <w:p>
-      <w:r>
-        <w:t xml:space="preserve">| 2 | 관할 건축부서/베뉴 시설팀 | 가설건축물 축조신고서, 피난안전 확인서, 임시사용승인 확인 | 대형 텐트, 임시 전시장, 복층/다층 임시구조물, 공사 중 구역 임시 사용 | 설치 전 신고·승인, 개장 전 피난안전 확인 | 건축법 시행규칙 별지 제8·8의2·17호서식 | open |</w:t>
-      </w:r>
-    </w:p>
-    <w:p>
-      <w:r>
-        <w:t xml:space="preserve">| 3 | 베뉴 운영/시설/전기/방재 담당 | 부스 시공, 전기, 하역, 소방통로, 반입제한, 제출 안전서류 | 전시장·컨벤션센터·공연장 등 베뉴를 사용하는 경우 | 주최자 매뉴얼 기한, 시공 전, 개장 전 | 코엑스 운영규정/안전수칙과 venue-facility sourceSpan 확인 | open |</w:t>
-      </w:r>
-    </w:p>
-    <w:p>
-      <w:r>
-        <w:t xml:space="preserve">| 4 | 소방서/베뉴 방재실/안전총괄 | 소방·피난 점검표, 화기·위험물 반입 승인, 임시소방시설 확인 | 화기, 위험물, 임시전기, 부스·무대 설치, 피난통로 차단 위험이 있는 경우 | 설치 전, 개장 전, 피크 전, 철거 전 | 화재예방법·소방시설법 하위 별표와 베뉴 방재실 승인조건 | open |</w:t>
-      </w:r>
-    </w:p>
-    <w:p>
-      <w:r>
-        <w:t xml:space="preserve">| 5 | 개인정보 보호책임자/등록 대행사/보안 담당 | 개인정보 처리방침, 위탁계약, CCTV 안내, 접근권한·접속기록 점검 | 등록, QR/출입증, CCTV, 촬영, 앱 신고, VIP/초청자 명단 처리 | 수집 전 고지, 행사 전 위탁·보안점검, 종료 후 파기 | 개인정보보호법 제15·22·25·26·29·30조와 시행령 안전성 확보 조치 | open |</w:t>
-      </w:r>
-    </w:p>
-    <w:p>
-      <w:r>
-        <w:t xml:space="preserve">| 6 | 경찰/경비업체/베뉴 보안실 | 경비업 허가 범위, 경비지도사, 경비원 명부, 배치·폐지 신고 | VIP, 보안검색, 민간경비, 혼잡·교통유도경비를 운영하는 경우 | 배치 전, 20일 이상 배치 또는 신고 대상 조건 확인 | 경비업법·시행령·시행규칙 별표/별지 서식 | open |</w:t>
-      </w:r>
-    </w:p>
-    <w:p>
-      <w:r>
-        <w:t xml:space="preserve">| 7 | 의료담당/AED 관리책임자/119·이송병원 | 응급의료·AED·구급 이송 계획, AED 점검·교육·관리서류 | 대규모 인파, 고령자/영유아/장애인, 스탠딩 공연, 야외·폭염·야간 행사 | 개장 전, 운영 중, 사용/이송 발생 시 | 응급의료법 AED 설치·관리, 시행규칙 구급차 장비·운행기록 기준 | open |</w:t>
-      </w:r>
-    </w:p>
-    <w:p>
-      <w:r>
-        <w:t xml:space="preserve">| 8 | 시공/하역/전기 협력사/안전총괄 | 설치·철거 작업자 안전계획서, 작업계획서, 교육명단, PPE·작업중지 기준 | 부스·무대·트러스·전기·고소·중량물·화기·철거 작업이 있는 경우 | 작업 전, 작업 중 변경 시, 철거 전 | 산안법, 산안기준규칙 제38·42·321조, KOSHA Guide worker-safety layer | open |</w:t>
+        <w:t xml:space="preserve">| 1 | 관할 건축부서/베뉴 시설팀 | 가설건축물 축조신고서, 피난안전 확인서, 임시사용승인 확인 | 대형 텐트, 임시 전시장, 복층/다층 임시구조물, 공사 중 구역 임시 사용 | 설치 전 신고·승인, 개장 전 피난안전 확인 | 건축법 시행규칙 별지 제8·8의2·17호서식 | open |</w:t>
+      </w:r>
+    </w:p>
+    <w:p>
+      <w:r>
+        <w:t xml:space="preserve">| 2 | 베뉴 운영/시설/전기/방재 담당 | 부스 시공, 전기, 하역, 소방통로, 반입제한, 제출 안전서류 | 전시장·컨벤션센터·공연장 등 베뉴를 사용하는 경우 | 주최자 매뉴얼 기한, 시공 전, 개장 전 | 코엑스 운영규정/안전수칙과 venue-facility sourceSpan 확인 | open |</w:t>
+      </w:r>
+    </w:p>
+    <w:p>
+      <w:r>
+        <w:t xml:space="preserve">| 3 | 소방서/베뉴 방재실/안전총괄 | 소방·피난 점검표, 화기·위험물 반입 승인, 임시소방시설 확인 | 화기, 위험물, 임시전기, 부스·무대 설치, 피난통로 차단 위험이 있는 경우 | 설치 전, 개장 전, 피크 전, 철거 전 | 화재예방법·소방시설법 하위 별표와 베뉴 방재실 승인조건 | open |</w:t>
+      </w:r>
+    </w:p>
+    <w:p>
+      <w:r>
+        <w:t xml:space="preserve">| 4 | 개인정보 보호책임자/등록 대행사/보안 담당 | 개인정보 처리방침, 위탁계약, CCTV 안내, 접근권한·접속기록 점검 | 등록, QR/출입증, CCTV, 촬영, 앱 신고, VIP/초청자 명단 처리 | 수집 전 고지, 행사 전 위탁·보안점검, 종료 후 파기 | 개인정보보호법 제15·22·25·26·29·30조와 시행령 안전성 확보 조치 | open |</w:t>
+      </w:r>
+    </w:p>
+    <w:p>
+      <w:r>
+        <w:t xml:space="preserve">| 5 | 의료담당/AED 관리책임자/119·이송병원 | 응급의료·AED·구급 이송 계획, AED 점검·교육·관리서류 | 대규모 인파, 고령자/영유아/장애인, 스탠딩 공연, 야외·폭염·야간 행사 | 개장 전, 운영 중, 사용/이송 발생 시 | 응급의료법 AED 설치·관리, 시행규칙 구급차 장비·운행기록 기준 | open |</w:t>
+      </w:r>
+    </w:p>
+    <w:p>
+      <w:r>
+        <w:t xml:space="preserve">| 6 | 시공/하역/전기 협력사/안전총괄 | 설치·철거 작업자 안전계획서, 작업계획서, 교육명단, PPE·작업중지 기준 | 부스·무대·트러스·전기·고소·중량물·화기·철거 작업이 있는 경우 | 작업 전, 작업 중 변경 시, 철거 전 | 산안법, 산안기준규칙 제38·42·321조, KOSHA Guide worker-safety layer | open |</w:t>
       </w:r>
     </w:p>
     <w:p/>

</xml_diff>